<commit_message>
Revelation: full meaning audit 2026-09-23 — 65 KO fixes + 3 EN titles + 22 KO titles (KR) + 2 splits meta corrections, gates 1-8 PASS, 2 merge candidates pending (R1 ch5, R2 ch16)
</commit_message>
<xml_diff>
--- a/gdocs_build/Revelation.docx
+++ b/gdocs_build/Revelation.docx
@@ -289,7 +289,7 @@
               <w:rPr>
                 <w:sz w:val="18"/>
               </w:rPr>
-              <w:t>이걸 읽는 사람은 진짜 복 받은 거야! 이 예언의 말씀을 듣고 지키는 사람들도 완전 복 받은 거야!</w:t>
+              <w:t>이걸 읽는 사람은 진짜 복 받은 거야! 이 책에 적힌 모든 말씀을 듣고 지키는 사람들도 완전 복 받은 거야!</w:t>
             </w:r>
           </w:p>
         </w:tc>
@@ -1579,7 +1579,7 @@
               <w:rPr>
                 <w:sz w:val="18"/>
               </w:rPr>
-              <w:t>서머나 교회 천사한테 이렇게 써라. 처음이자 마지막이신 분, 죽었다가 다시 살아나신 분이 말씀하신다.</w:t>
+              <w:t>서머나 교회 천사한테 이렇게 써라. 시작이자 끝이신 분, 처음이자 마지막이신 분, 죽었다가 다시 살아나신 분이 말씀하신다.</w:t>
             </w:r>
           </w:p>
         </w:tc>
@@ -2218,7 +2218,7 @@
               <w:rPr>
                 <w:sz w:val="18"/>
               </w:rPr>
-              <w:t>“이제 그만해! 더 이상 걔네를 내버려두지 마. 내가 곧 갈 거야. 걔네는 진짜 너무 싫어. 내 말씀의 칼로 다 찢어버릴 거야.</w:t>
+              <w:t>“이제 그만해! 더 이상 걔네한테 굴복하지 마. 내가 곧 갈 거야. 걔네는 진짜 너무 싫어. 내 말씀의 칼로 다 찢어버릴 거야.</w:t>
             </w:r>
           </w:p>
         </w:tc>
@@ -4115,7 +4115,7 @@
               <w:rPr>
                 <w:sz w:val="18"/>
               </w:rPr>
-              <w:t>라오디게아에, 교회의 천사한테 이렇게 써라. 하나님의 예스, 믿을 수 있고 정확한 증인, 하나님이 창조하신 모든 것의 첫열매가 말한다.</w:t>
+              <w:t>라오디게아에, 교회의 천사한테 이렇게 써라. 하나님의 예스, 믿을 수 있고 정확한 증인, 하나님 창조의 첫 번째이신 분이 말한다.</w:t>
             </w:r>
           </w:p>
         </w:tc>
@@ -4671,7 +4671,7 @@
               <w:rPr>
                 <w:sz w:val="18"/>
               </w:rPr>
-              <w:t>그때 내가 봤어. 와!—하늘로 열린 문이 있었어. 나팔 소리 같았던 첫 번째 목소리, 내 환상에서 처음 들었던 그 목소리가 말했어. “올라와. 앞으로 일어날 일을 보여줄게.”</w:t>
+              <w:t>그때 내가 봤어. 와!—하늘로 열린 문이 있었어. 나팔 소리 같았던 첫 번째 목소리, 내 환상에서 처음 들었던 그 목소리가 말했어. “올라와, 들어와. 앞으로 일어날 일을 보여줄게.”</w:t>
             </w:r>
           </w:p>
         </w:tc>
@@ -4742,7 +4742,7 @@
               <w:rPr>
                 <w:sz w:val="18"/>
               </w:rPr>
-              <w:t>나는 바로 깊은 경배 중에 사로잡혔어. 와!—하늘에 보좌가 있었고, 보좌에 앉으신 분이 계셨어. 그분의 모습은 벽옥과 카넬리언 같았어. 보좌 주위에는 에메랄드 같은 무지개가 있었어. 보좌 주위에는 스물네 보좌가 있었고, 그 보좌들에는 스물네 장로가 앉아 있었어. 흰 옷을 입고 머리에는 금 면류관을 쓰고 있었어. 보좌에서는 번개가 치고, 목소리가 나고, 우레가 울렸어. 보좌 앞에는 일곱 횃불이 타오르고 있었어. 그게 하나님의 일곱 영이야. 보좌 앞에는 수정처럼 맑은 유리 바다가 있었어.</w:t>
+              <w:t>나는 바로 깊은 경배 중에 사로잡혔어. 와!—하늘에 보좌가 있었고, 보좌에 앉으신 분이 계셨어. 그분의 모습은 호박색과 불꽃 같은 보석 빛 같았어. 보좌 주위에는 에메랄드 같은 빛무리가 있었어. 보좌 주위에는 스물네 보좌가 있었고, 그 보좌들에는 스물네 장로가 앉아 있었어. 흰 옷을 입고 머리에는 금 면류관을 쓰고 있었어. 보좌에서는 번개가 치고, 우레가 울렸어. 보좌 앞에는 일곱 횃불이 타오르고 있었어. 그게 하나님의 일곱 영이야. 보좌 앞에는 수정처럼 맑은 유리 바다가 있었어.</w:t>
             </w:r>
           </w:p>
         </w:tc>
@@ -4821,7 +4821,7 @@
               <w:rPr>
                 <w:sz w:val="18"/>
               </w:rPr>
-              <w:t>보좌 주위를 어슬렁거리는 네 생물이 있었어. 모두 눈이야. 앞을 보는 눈, 뒤를 보는 눈. 첫째 생물은 사자 같았고, 둘째는 송아지 같았고, 셋째는 사람 얼굴 같았고, 넷째는 날아가는 독수리 같았어. 네 생물은 각각 여섯 날개를 가졌고, 날개 안팎으로 눈이 가득했어. 밤낮 쉬지 않고 말했어.</w:t>
+              <w:t>보좌 주위를 어슬렁거리는 네 생물이 있었어. 모두 눈이야. 앞을 보는 눈, 뒤를 보는 눈. 첫째 생물은 사자 같았고, 둘째는 황소 같았고, 셋째는 사람 얼굴 같았고, 넷째는 날아가는 독수리 같았어. 네 생물은 각각 여섯 날개를 가졌고, 날개 안팎으로 눈이 가득했어. 밤낮 쉬지 않고 말했어.</w:t>
             </w:r>
           </w:p>
         </w:tc>
@@ -5243,7 +5243,7 @@
               <w:rPr>
                 <w:sz w:val="18"/>
               </w:rPr>
-              <w:t>보좌에 앉으신 분의 오른손에 두루마리가 있는 걸 봤어. 앞뒤로 글이 쓰여 있었고, 일곱 도장으로 봉인되어 있었어. 힘센 천사가 큰 목소리로 외치는 걸 봤어. “누가 이 두루마리를 펴고 그 도장을 뗄 자격이 있느냐?”</w:t>
+              <w:t>보좌에 앉으신 분의 오른손에 두루마리가 있는 걸 봤어. 앞뒤로 글이 쓰여 있었고, 일곱 도장으로 봉인되어 있었어. 힘센 천사가 우레 같은 큰 목소리로 외치는 걸 봤어. “누가 이 두루마리를 펴고 그 도장을 뗄 수 있느냐?”</w:t>
             </w:r>
           </w:p>
         </w:tc>
@@ -5385,7 +5385,7 @@
               <w:rPr>
                 <w:sz w:val="18"/>
               </w:rPr>
-              <w:t>나는 울고 울고 울었어. 그 두루마리를 펴고 읽을 자격이 있는 사람이 아무도 없었거든. 장로 중 한 분이 나한테 말했어. “울지 마. 봐. 유다 지파의 사자, 다윗의 뿌리가 이겼어! 그분이 이 두루마리를 펴고 일곱 도장을 뗄 수 있어.”</w:t>
+              <w:t>나는 울고 울고 울었어. 그 두루마리를 펴고 읽을 수 있는 사람이 아무도 없었거든. 장로 중 한 분이 나한테 말했어. “울지 마. 봐. 유다 지파의 사자, 다윗의 뿌리가 이겼어! 그분이 이 두루마리를 펴고 일곱 도장을 뗄 수 있어.”</w:t>
             </w:r>
           </w:p>
         </w:tc>
@@ -5535,7 +5535,7 @@
               <w:rPr>
                 <w:sz w:val="18"/>
               </w:rPr>
-              <w:t>두루마리를 받으시자, 네 동물과 스물네 장로가 어린 양 앞에 엎드렸어. 각각 거문고와 향이 가득한 금 대접을 가지고 있었어. 그 향은 성도들의 기도야. 그들이 새 노래를 불렀어. “당신은 이 두루마리를 받고 그 도장을 뗄 자격이 있으십니다! 당신이 죽임당하셨고, 당신의 피로 사람들을 사서 하나님께 드리셨기 때문입니다. 각 족속과 언어와 백성과 나라에서 온 사람들이요. 당신은 그들을 나라와 제사장으로 삼으셨고, 그들이 땅에서 왕 노릇 할 겁니다!”</w:t>
+              <w:t>두루마리를 받으시자, 네 동물과 스물네 장로가 어린 양 앞에 엎드렸어. 각각 거문고와 향이 가득한 금 대접을 가지고 있었어. 그 향은 성도들의 기도야. 그들이 새 노래를 불렀어. “당신은 이 두루마리를 받고 그 도장을 뗄 자격이 있으십니다! 당신이 죽임당하셨고, 당신의 피로 사람들을 사서 하나님께 드리셨기 때문입니다. 온 땅에서 온 사람들이요. 당신은 그들을 나라와 제사장으로 삼으셨고, 그들이 땅에서 왕 노릇 할 겁니다!”</w:t>
             </w:r>
           </w:p>
         </w:tc>
@@ -5638,7 +5638,7 @@
               <w:rPr>
                 <w:sz w:val="18"/>
               </w:rPr>
-              <w:t>다시 봤어. 보좌와 동물들과 장로들 주위에 많은 천사들의 목소리를 들었어—만만의 만 배, 천의 천 배야. 큰 목소리로 말했어. “죽임당하신 어린 양은 권세와 부와 지혜와 힘과 존귀와 영광과 찬양을 받으시기에 합당하십니다!”</w:t>
+              <w:t>다시 봤어. 보좌와 동물들과 장로들 주위에 많은 천사들의 목소리를 들었어—만만의 만 배, 천의 천 배야. 큰 목소리로 노래했어. “죽임당하신 어린 양은 권세와 부와 지혜와 힘과 존귀와 영광과 찬양을 받으시기에 합당하십니다!”</w:t>
             </w:r>
           </w:p>
         </w:tc>
@@ -5709,7 +5709,7 @@
               <w:rPr>
                 <w:sz w:val="18"/>
               </w:rPr>
-              <w:t>하늘에 있는 모든 피조물, 땅에 있는 모든 것, 땅 밑에 있는 것, 바다에 있는 것, 그 안에 있는 모든 것이 말하는 걸 들었어. “보좌에 앉으신 분과 어린 양에게 찬양과 존귀와 영광과 권세가 영원히 있기를!”</w:t>
+              <w:t>하늘에 있는 모든 피조물, 땅에 있는 모든 것, 땅 밑에 있는 것, 바다에 있는 것, 그 안에 있는 모든 것이 노래하는 걸 들었어. “보좌에 앉으신 분과 어린 양에게 찬양과 존귀와 영광과 권세가 영원히 있기를!”</w:t>
             </w:r>
           </w:p>
         </w:tc>
@@ -5981,7 +5981,7 @@
               <w:rPr>
                 <w:sz w:val="18"/>
               </w:rPr>
-              <w:t>어린 양이 일곱 도장 중 첫째를 떼는 걸 지켜봤어. 네 동물 중 하나가 우레 같은 목소리로 말하는 걸 들었어. “와!” 그래서 내가 봤어. 흰 말이 있었어! 그 말을 탄 사람은 활을 가지고 있었어. 그에게 면류관이 주어졌고, 이기면서 나갔어.</w:t>
+              <w:t>어린 양이 일곱 도장 중 첫째를 떼는 걸 지켜봤어. 네 동물 중 하나가 우레 같은 목소리로 말하는 걸 들었어. “와!” 그래서 내가 봤어. 흰 말이 있었어! 그 말을 탄 사람은 활을 가지고 있었어. 그에게 면류관이 주어졌고, 이기고 또 이기며 나갔어.</w:t>
             </w:r>
           </w:p>
         </w:tc>
@@ -6052,7 +6052,7 @@
               <w:rPr>
                 <w:sz w:val="18"/>
               </w:rPr>
-              <w:t>어린 양이 둘째 도장을 떼자, 둘째 동물이 외치는 걸 들었어. “와!” 다른 말이 나왔어. 붉은 말이었어. 그 말을 탄 사람에게는 땅에서 평화를 거두어가고 사람들이 서로 죽이게 할 권세가 주어졌어. 그에게 큰 칼이 주어졌어.</w:t>
+              <w:t>어린 양이 둘째 도장을 떼자, 둘째 동물이 외치는 걸 들었어. “와!” 다른 말이 나왔어. 붉은 말이었어. 그 말을 탄 사람에게는 땅에서 평화를 거두어가고 사람들이 서로에게 칼을 들이대며 죽이게 할 권세가 주어졌어. 그에게 큰 칼이 주어졌어.</w:t>
             </w:r>
           </w:p>
         </w:tc>
@@ -6194,7 +6194,7 @@
               <w:rPr>
                 <w:sz w:val="18"/>
               </w:rPr>
-              <w:t>어린 양이 넷째 도장을 떼자, 넷째 동물의 목소리를 들었어. “와!” 그래서 내가 봤어. 창백한 말이 있었어! 그 말을 탄 사람의 이름은 죽음이었고, 지옥이 그를 따랐어. 그들에게는 땅의 4분의 1을 다스릴 권세가 주어졌어. 칼과 기근과 질병과 땅의 들짐승으로 죽이게 할 권세야.</w:t>
+              <w:t>어린 양이 넷째 도장을 떼자, 넷째 동물의 목소리를 들었어. “와!” 그래서 내가 봤어. 창백한 말이 있었어! 그 말을 탄 사람의 이름은 죽음이었고, 지옥이 그를 따랐어. 그들에게는 땅의 4분의 1을 멸할 권세가 주어졌어. 칼과 기근과 질병과 땅의 들짐승으로 죽이게 할 권세야.</w:t>
             </w:r>
           </w:p>
         </w:tc>
@@ -6265,7 +6265,7 @@
               <w:rPr>
                 <w:sz w:val="18"/>
               </w:rPr>
-              <w:t>어린 양이 다섯째 도장을 떼자, 하나님의 말씀과 예수의 증언 때문에 죽임당한 사람들의 영혼을 제단 아래서 봤어. 그들이 큰 목소리로 외쳤어. “거룩하고 참되신 주님이시여! 언제까지 심판하지 않으시고 우리 피의 원수를 갚아주지 않으시나요?” 그들 각자에게 흰 두루마기가 주어졌어. 그들에게 말했어. “조금 더 쉬어. 너희와 같이 죽을 동료 종들과 형제들의 수가 찰 때까지야.”</w:t>
+              <w:t>어린 양이 다섯째 도장을 떼자, 하나님의 말씀과 예수의 증언 때문에 죽임당한 사람들의 영혼을 제단 아래서 봤어. 그들이 큰 목소리로 외쳤어. “강하시고 거룩하고 참되신 주님이시여! 언제까지 심판하지 않으시고 우리 피의 원수를 갚아주지 않으시나요?” 그들 각자에게 흰 두루마기가 주어졌어. 그들에게 말했어. “조금 더 쉬어. 너희와 같이 죽을 동료 종들과 형제들의 수가 찰 때까지야.”</w:t>
             </w:r>
           </w:p>
         </w:tc>
@@ -6679,7 +6679,7 @@
               <w:rPr>
                 <w:sz w:val="18"/>
               </w:rPr>
-              <w:t>그리고 내가 들었어. 도장 찍은 사람의 수가 십사만 사천명이야. 이스라엘의 모든 지파에서 도장 찍은 사람들이야. 유다 지파에서 만 이천 명, 르운 지파에서 만 이천 명, 갓 지파에서 만 이천 명, 아셔 지파에서 만 이천 명, 납달리 지파에서 만 이천 명, 미낫세 지파에서 만 이천 명, 시므온 지파에서 만 이천 명, 레위 지파에서 만 이천 명, 잉사갈 지파에서 만 이천 명, 스블론 지파에서 만 이천 명, 요셉 지파에서 만 이천 명, 베냐민 지파에서 만 이천 명이라고 들었어.</w:t>
+              <w:t>그리고 내가 들었어. 도장 찍은 사람의 수가 십사만 사천명이야. 이스라엘의 모든 지파에서 도장 찍은 사람들이야. 유다 지파에서 만 이천 명, 르우벤 지파에서 만 이천 명, 갓 지파에서 만 이천 명, 아셔 지파에서 만 이천 명, 납달리 지파에서 만 이천 명, 므낫세 지파에서 만 이천 명, 시므온 지파에서 만 이천 명, 레위 지파에서 만 이천 명, 잇사갈 지파에서 만 이천 명, 스블론 지파에서 만 이천 명, 요셉 지파에서 만 이천 명, 베냐민 지파에서 만 이천 명이라고 들었어.</w:t>
             </w:r>
           </w:p>
         </w:tc>
@@ -6916,7 +6916,7 @@
               <w:rPr>
                 <w:sz w:val="18"/>
               </w:rPr>
-              <w:t>그때 장로 중에 한 분이 나한테 물었어. “흰 두루마기를 입은 이 사람들은 누구지? 어디서 왔지?” 내가 대답했어. “장로님, 당신이 알잖아요.”</w:t>
+              <w:t>그때 장로 중에 한 분이 나한테 물었어. “흰 두루마기를 입은 이 사람들은 누구지? 어디서 왔지?” 당황해서 대답했어. “장로님, 저는 모르겠어요. 장로님이 아시잖아요.”</w:t>
             </w:r>
           </w:p>
         </w:tc>
@@ -7685,7 +7685,7 @@
               <w:rPr>
                 <w:sz w:val="18"/>
               </w:rPr>
-              <w:t>내가 자세히 보고 들었어. 한 독수리가 하늘 한가운데를 날아가면서 큰 목소리로 외치는 걸. “땅에 사는 사람들에게 화, 화, 화가 있을 거야! 아직 나팔을 불지 않은 세 천사의 나팔 소리 때문이야!”</w:t>
+              <w:t>내가 자세히 보고 들었어. 한 독수리가 하늘 한가운데를 불길하게 날아가면서 큰 목소리로 외치는 걸. “땅에 사는 사람들에게 화, 화, 화가 있을 거야! 화가 오고 있어! 아직 나팔을 불지 않은 세 천사의 나팔 소리 때문이야!”</w:t>
             </w:r>
           </w:p>
         </w:tc>
@@ -7965,7 +7965,7 @@
               <w:rPr>
                 <w:sz w:val="18"/>
               </w:rPr>
-              <w:t>그 메뚜기들의 모양은 전쟁을 위해 준비된 말들 같았어. 머리에는 금 면류관 같은 것이 있었고, 얼굴은 사람의 얼굴 같았어. 머리카락은 여자의 머리카락 같았고, 이는 사자의 이 같았어. 철 흉갑 같은 흉갑을 입었어. 날개의 소리는 전쟁터로 달려가는 많은 말들과 병거의 소리 같았어. 꼬리는 전갈 같았고, 꼬리에는 쏘는 것이 있었어. 다섯 달 동안 사람들을 해할 권세가 꼬리에 있었어. 그들 위에 왕이 있었어. 무저갱의 천사야. 히브리어로 이름은 아바돈이고, 헬라어로는 아볼루온이야.</w:t>
+              <w:t>그 메뚜기들의 모양은 전쟁을 위해 준비된 말들 같았어. 머리에는 금 면류관 같은 것이 있었고, 얼굴은 사람의 얼굴 같았어. 머리카락은 여자의 머리카락 같았고, 이는 사자의 이 같았어. 철 흉갑 같은 흉갑을 입었어. 날개의 소리는 전쟁터로 달려가는 많은 말들과 병거의 소리 같았어. 꼬리는 전갈 같았고, 꼬리에는 쏘는 것이 있었어. 다섯 달 동안 사람들을 해할 권세가 꼬리에 있었어. 그들 위에 왕이 있었어. 무저갱의 천사야. 히브리어로 이름은 아바돈이고, 헬라어로는 아볼루온이야. ‘파괴자’라는 뜻이야.</w:t>
             </w:r>
           </w:p>
         </w:tc>
@@ -8801,7 +8801,7 @@
               <w:rPr>
                 <w:sz w:val="18"/>
               </w:rPr>
-              <w:t>“한편, 내가 내 두 증인을 내세울 거야. 굵은 베옷을 입고, 천이백육십 일 동안 예언할 거야.” 이 두 사람은 두 감람나무이자 두 촛대야. 땅의 주 앞에 서 있는 사람들이지. 누가 그들을 해하려 하면, 입에서 불이 나와서 원수들을 삼켜버려. 누가 그들을 해하려 하면, 꼭 이렇게 죽어야 해. 이 사람들한테는 하늘이 닫혀서 예언하는 동안 비가 오지 않게 할 권세가 있어. 또 물을 피로 바꾸고, 원하는 만큼 땅을 온갖 재앙으로 칠 권세도 있어.</w:t>
+              <w:t>“한편, 내가 내 두 증인을 내세울 거야. 굵은 베옷을 입고, 천이백육십 일 동안 예언할 거야.” 이 두 사람은 두 감람나무이자 두 촛대야. 땅의 주 앞에 서 있는 사람들이지. 누가 그들을 해하려 하면, 입에서 불이 나와서 원수들을 삼켜버려. 누가 그들을 해하려 하면, 꼭 이렇게 죽어야 해. 이 사람들한테는 하늘이 닫혀서 예언하는 동안 비가 오지 않게 할 권세가 있어. 또 강과 샘물을 피로 바꾸고, 원하는 만큼 땅을 온갖 재앙으로 칠 권세도 있어.</w:t>
             </w:r>
           </w:p>
         </w:tc>
@@ -9085,7 +9085,7 @@
               <w:rPr>
                 <w:sz w:val="18"/>
               </w:rPr>
-              <w:t>둘째 재앙이 지나갔어. 셋째 재앙이 바로 코앞이야.</w:t>
+              <w:t>둘째 화가 지나갔어. 셋째 화가 바로 코앞이야.</w:t>
             </w:r>
           </w:p>
         </w:tc>
@@ -9878,7 +9878,7 @@
               <w:rPr>
                 <w:sz w:val="18"/>
               </w:rPr>
-              <w:t>하늘에서 우렁찬 목소리를 들었어. “이제 구원이 왔어! 우리 하나님의 권세와 나라와 그분의 그리스도의 권위가 임했어! 우리 형제들을 고소하던 자가 쫓겨났거든. 밤낮 우리 하나님 앞에서 그들을 고소하던 자야. 그들이 어린 양의 피와 자기들의 증언의 말씀으로 그를 이겼어. 그들은 죽음 앞에서도 자기 목숨을 아끼지 않았어. 그러니 하늘아, 하늘에 사는 자들아, 기뻐하라! 하지만 땅과 바다야, 조심해! 마귀가 너희에게 내려갔거든. 자기 때가 얼마 남지 않은 걸 알고 펄펄 뛰면서.”</w:t>
+              <w:t>하늘에서 우렁찬 목소리를 들었어. “이제 구원이 왔어! 우리 하나님의 권세와 나라와 그분의 그리스도의 권위가 임했어! 우리 형제들을 고소하던 자가 쫓겨났거든. 밤낮 우리 하나님 앞에서 그들을 고소하던 자야. 그들이 어린 양의 피와 자기들의 증언의 말씀으로 그를 이겼어. 그들은 죽음 앞에서도 자기 목숨을 아끼지 않았어. 그러니 하늘아, 하늘에 사는 자들아, 기뻐하라! 하지만 땅과 바다야, 조심해! 크게 추락한 마귀가 너희에게 내려갔거든. 자기 때가 얼마 남지 않은 걸 알고 펄펄 뛰면서.”</w:t>
             </w:r>
           </w:p>
         </w:tc>
@@ -10292,7 +10292,7 @@
               <w:rPr>
                 <w:sz w:val="18"/>
               </w:rPr>
-              <w:t>짐승에게 큰소리치고 신성모독하는 입이 주어졌어. 마흔두 달 동안 제멋대로 할 권세가 주어졌어. 짐승이 입을 벌려 하나님을 모독했어. 그분의 이름과 그분의 처소와 하늘에 사는 사람들을 모독했어. 거룩한 백성과 싸워서 이길 권세도 주어졌어. 모든 족속과 백성과 언어와 민족을 다스릴 권세도 주어졌어. 땅에 사는 모든 사람이 짐승에게 경배할 거야. 세상이 창조된 이후로 죽임당한 어린 양의 생명책에 이름이 기록되지 않은 사람들이야.</w:t>
+              <w:t>짐승에게 큰소리치고 신성모독하는 입이 주어졌어. 마흔두 달 동안 제멋대로 할 권세가 주어졌어. 짐승이 입을 벌려 하나님을 모독했어. 그분의 이름과 그분의 교회와 하늘에 사는 사람들을 모독했어. 거룩한 백성과 싸워서 이길 권세도 주어졌어. 모든 족속과 백성과 언어와 민족을 다스릴 권세도 주어졌어. 땅에 사는 모든 사람이 짐승에게 경배할 거야. 세상이 창조된 이후로 죽임당한 어린 양의 생명책에 이름이 기록되지 않은 사람들이야.</w:t>
             </w:r>
           </w:p>
         </w:tc>
@@ -11045,7 +11045,7 @@
               <w:rPr>
                 <w:sz w:val="18"/>
               </w:rPr>
-              <w:t>내가 봤어. 또 다른 천사가 하늘 한가운데를 날아가는 걸. 땅에 사는 사람들—모든 나라와 족속과 언어와 백성—에게 전할 영원한 기쁜 소식을 가지고 있었어. 큰 목소리로 말했어. “하나님을 두려워하고 그분께 영광을 돌려라! 그분의 심판 시간이 왔거든. 하늘과 땅과 바다와 물의 샘을 만드신 분께 경배하라!”</w:t>
+              <w:t>내가 봤어. 또 다른 천사가 하늘 한가운데를 날아가는 걸. 땅에 사는 사람들—모든 나라와 족속과 언어와 백성—에게 전할 영원한 메시지를 가지고 있었어. 큰 목소리로 말했어. “하나님을 두려워하고 그분께 영광을 돌려라! 그분의 심판 시간이 왔거든. 하늘과 땅과 바다와 물의 샘을 만드신 분께 경배하라!”</w:t>
             </w:r>
           </w:p>
         </w:tc>
@@ -11116,7 +11116,7 @@
               <w:rPr>
                 <w:sz w:val="18"/>
               </w:rPr>
-              <w:t>둘째 천사가 뒤따라 외쳤어. “무너졌다, 무너졌다, 큰 바벨론이 무너졌다! 모든 나라에게 자기 음행의 진노의 포도주를 마시게 한 도시야!”</w:t>
+              <w:t>둘째 천사가 뒤따라 외쳤어. “무너졌다, 무너졌다, 큰 바벨론이 무너졌다! 모든 나라에게 자기 음행의 포도주를 마시게 한 도시야!”</w:t>
             </w:r>
           </w:p>
         </w:tc>
@@ -11684,7 +11684,7 @@
               <w:rPr>
                 <w:sz w:val="18"/>
               </w:rPr>
-              <w:t>천사가 낫을 땅에 휘둘러 땅의 포도를 거두어 하나님의 진노의 큰 포도주 틀에 던졌어. 포도주 틀이 성 밖에서 밟혔어. 틀에서 피가 흘러나왔어. 말의 고삐까지 찼어. 천육백 스타디온에 퍼졌어.</w:t>
+              <w:t>천사가 낫을 땅에 휘둘러 땅의 포도를 거두어 하나님의 진노의 큰 포도주 틀에 던졌어. 포도주 틀이 성 밖에서 밟혔어. 틀에서 피가 흘러나왔어. 말의 고삐까지 찼어. 이백 마일에 퍼졌어.</w:t>
             </w:r>
           </w:p>
         </w:tc>
@@ -11695,7 +11695,7 @@
         <w:pStyle w:val="Heading1"/>
       </w:pPr>
       <w:r>
-        <w:t>Chapter 15 — The Seven Angels and the Final Smackdown</w:t>
+        <w:t>Chapter 15 — The Seven Angels and the Last Seven Disasters</w:t>
       </w:r>
     </w:p>
     <w:tbl>
@@ -12035,7 +12035,7 @@
               <w:rPr>
                 <w:sz w:val="18"/>
               </w:rPr>
-              <w:t>모세의 노래와 어린 양의 노래를 불렀어. “전능하신 주 하나님이시여, 당신의 행위는 크고 놀랍습니다! 만국의 왕이시여, 당신의 길은 의롭고 참되십니다! 주여, 누가 당신을 두려워하지 않고 당신의 이름에 영광을 돌리지 않겠습니까? 당신만이 거룩하십니다. 모든 나라가 와서 당신 앞에 경배할 겁니다. 당신의 의로운 심판이 드러났기 때문입니다!”</w:t>
+              <w:t>하나님의 종 모세의 노래와 어린 양의 노래를 불렀어. “전능하신 주 하나님이시여, 당신의 행위는 크고 놀랍습니다! 만국의 왕이시여, 당신의 길은 의롭고 참되십니다! 주여, 누가 당신을 두려워하지 않고 당신의 이름에 영광을 돌리지 않겠습니까? 당신만이 거룩하십니다. 모든 나라가 와서 당신 앞에 경배할 겁니다. 당신의 의로운 심판이 드러났기 때문입니다!”</w:t>
             </w:r>
           </w:p>
         </w:tc>
@@ -12117,7 +12117,7 @@
         <w:pStyle w:val="Heading1"/>
       </w:pPr>
       <w:r>
-        <w:t>Chapter 16 — The Seven Bowls of Epic Ownage</w:t>
+        <w:t>Chapter 16 — The Seven Bowls of Total Takedown</w:t>
       </w:r>
     </w:p>
     <w:tbl>
@@ -12236,7 +12236,7 @@
                 <w:b/>
                 <w:sz w:val="18"/>
               </w:rPr>
-              <w:t>진노의 일곱 대접</w:t>
+              <w:t>일곱 재앙을 쏟으심</w:t>
             </w:r>
           </w:p>
         </w:tc>
@@ -12449,7 +12449,7 @@
               <w:rPr>
                 <w:sz w:val="18"/>
               </w:rPr>
-              <w:t>둘째 천사가 자기 대접을 바다에 쏟았어. 바다가 죽은 사람의 피처럼 되었고, 바다에 있는 모든 생물이 죽었어.</w:t>
+              <w:t>둘째 천사가 자기 대접을 바다에 쏟았어. 바다가 피로 엉켰고, 바다에 있는 모든 생물이 죽었어.</w:t>
             </w:r>
           </w:p>
         </w:tc>
@@ -12899,7 +12899,7 @@
               <w:rPr>
                 <w:sz w:val="18"/>
               </w:rPr>
-              <w:t>“봐, 내가 도둑처럼 와! 깨어서 자기 옷을 지키는 사람은 복이 있어. 벌거벗고 다니며 부끄러움을 드러내지 않게 하려고.”</w:t>
+              <w:t>“깨어 있어라! 내가 예고도 없이 도둑처럼 와! 깨어서 자기 옷을 지키는 사람은 복이 있어. 벌거벗고 다니며 부끄러움을 드러내지 않게 하려고.”</w:t>
             </w:r>
           </w:p>
         </w:tc>
@@ -13041,7 +13041,7 @@
               <w:rPr>
                 <w:sz w:val="18"/>
               </w:rPr>
-              <w:t>일곱째 천사가 자기 대접을 공중에 쏟았어. 성전의 보좌에서 큰 목소리가 났어. “다 끝났다!” 번개와 목소리와 우레가 있었어. 큰 지진이 있었어. 사람이 땅에 생긴 이후로 이렇게 크고 강력한 지진은 없었어. 큰 도시가 세 부분으로 갈라졌어. 민족들의 도시들이 무너졌어. 큰 바벨론이 하나님 앞에 기억되어서, 그분의 맹렬한 진노의 포도주 잔을 받았어. 모든 섬이 도망쳤고, 산들도 찾을 수 없었어. 하늘에서 사람들에게 큰 우박이 떨어졌어. 한 달란트 정도 되는 우박이야. 사람들이 우박의 재앙 때문에 하나님을 모독했어. 그 재앙이 엄청 컸거든.</w:t>
+              <w:t>일곱째 천사가 자기 대접을 공중에 쏟았어. 성전의 보좌에서 큰 목소리가 났어. “다 끝났다!” 번개와 목소리와 우레가 있었어. 큰 지진이 있었어. 사람이 땅에 생긴 이후로 이렇게 크고 강력한 지진은 없었어. 큰 도시가 세 부분으로 갈라졌어. 민족들의 도시들이 무너졌어. 큰 바벨론이 하나님 앞에 기억되어서, 그분의 맹렬한 진노의 포도주 잔을 받았어. 모든 섬이 도망쳤고, 산들도 찾을 수 없었어. 하늘에서 사람들에게 큰 우박이 떨어졌어. 백 파운드 가까운 우박이야. 사람들이 우박에 맞아 짓눌리고 짓이겨지며 하나님을 모독했어. 그 재앙이 엄청 컸거든.</w:t>
             </w:r>
           </w:p>
         </w:tc>
@@ -13242,7 +13242,7 @@
               <w:rPr>
                 <w:sz w:val="18"/>
               </w:rPr>
-              <w:t>일곱 대접을 가진 일곱 천사 중 하나가 와서 나한테 말했어. “이리 와. 많은 물 위에 앉은 위대한 음녀가 받을 심판을 보여줄게. 땅의 왕들이 그 여자와 음행했고, 땅에 사는 사람들이 그 여자의 음행의 포도주에 취했어.”</w:t>
+              <w:t>일곱 대접을 가진 일곱 천사 중 하나가 와서 나한테 말했어. “이리 와. 많은 물 위에 앉은 위대한 음녀가 받을 심판을 보여줄게. 땅의 왕들이 그 여자와 음행했고, 땅에 사는 사람들이 그 여자의 음행에 취했어.”</w:t>
             </w:r>
           </w:p>
         </w:tc>
@@ -13384,7 +13384,7 @@
               <w:rPr>
                 <w:sz w:val="18"/>
               </w:rPr>
-              <w:t>깜짝 놀라서 눈을 비볐어. 고개를 저으며 감탄했어. 천사가 나한테 말했어. “왜 놀라? 내가 이 여자의 신비와 그 여자를 태운 짐승의 신비를 말해줄게. 일곱 머리와 열 뿔이 있는 짐승 말이야. 네가 본 짐승은 전에 있었다가 지금은 없고, 앞으로 무저갱에서 올라와 멸망으로 갈 거야. 땅에 사는 사람들, 세상이 창조된 이후로 생명책에 이름이 기록되지 않은 사람들은 놀랄 거야. 그 짐승이 전에 있었다가 지금은 없고 또 올 것이기 때문이야.”</w:t>
+              <w:t>깜짝 놀라서 눈을 비볐어. 고개를 저으며 감탄했어. 천사가 나한테 말했어. “왜 놀라? 내가 이 여자의 신비와 그 여자를 태운 짐승의 신비를 말해줄게. 일곱 머리와 열 뿔이 있는 짐승 말이야. 네가 본 짐승은 전에 있었다가 지금은 없고, 앞으로 무저갱에서 올라와 지옥으로 향할 거야. 땅에 사는 사람들, 세상이 창조된 이후로 생명책에 이름이 기록되지 않은 사람들은 놀랄 거야. 그 짐승이 전에 있었다가 지금은 없고 또 올 것이기 때문이야.”</w:t>
             </w:r>
           </w:p>
         </w:tc>
@@ -13455,7 +13455,7 @@
               <w:rPr>
                 <w:sz w:val="18"/>
               </w:rPr>
-              <w:t>“여기에 지혜로운 마음이 필요해. 일곱 머리는 여자가 앉은 일곱 산이야. 또 일곱 왕이야. 다섯은 쓰러졌고, 하나는 지금 있고, 다른 하나는 아직 오지 않았어. 오면 잠시 있어야 해. 전에 있었다가 지금은 없는 짐승은 여덟째 왕이야. 일곱 중 하나이면서 멸망으로 가.”</w:t>
+              <w:t>“여기에 지혜로운 마음이 필요해. 일곱 머리는 여자가 앉은 일곱 산이야. 또 일곱 왕이야. 다섯은 쓰러졌고, 하나는 지금 있고, 다른 하나는 아직 오지 않았어. 오면 잠시 있어야 해. 전에 있었다가 지금은 없는 짐승은 여덟째 왕이야. 일곱 중 하나이면서 지옥으로 가.”</w:t>
             </w:r>
           </w:p>
         </w:tc>
@@ -13526,7 +13526,7 @@
               <w:rPr>
                 <w:sz w:val="18"/>
               </w:rPr>
-              <w:t>“네가 본 열 뿔은 열 왕이야. 아직 왕국을 받지 못했지만, 짐승과 함께 한 시간 동안 왕처럼 권세를 받을 거야. 이들은 한마음이야. 자기들의 권세와 권위를 짐승에게 줄 거야. 그들이 어린 양과 싸울 거야. 그런데 어린 양이 그들을 이길 거야. 어린 양은 만주의 주, 만왕의 왕이시거든. 그분과 함께 있는 사람들—부르심을 받고 택함을 받고 신실한 사람들—도 이길 거야.”</w:t>
+              <w:t>“네가 본 열 뿔은 열 왕이야. 아직 왕국을 받지 못했지만, 짐승과 함께 아주 잠깐 동안 왕처럼 권세를 받을 거야. 이들은 뜻을 모았어. 자기들의 권세와 권위를 짐승에게 줄 거야. 그들이 어린 양과 싸울 거야. 그런데 어린 양이 그들을 이길 거야. 어린 양은 만주의 주, 만왕의 왕이시거든. 그분과 함께 있는 사람들—부르심을 받고 택함을 받고 신실한 사람들—도 이길 거야.”</w:t>
             </w:r>
           </w:p>
         </w:tc>
@@ -13597,7 +13597,7 @@
               <w:rPr>
                 <w:sz w:val="18"/>
               </w:rPr>
-              <w:t>천사가 나한테 말했어. “네가 본 물, 음녀가 앉은 곳은 백성과 무리와 민족과 언어야. 네가 본 열 뿔과 짐승이 음녀를 미워할 거야. 그 여자를 벌거벗기고 황폐하게 하고, 살을 먹고, 불로 태울 거야. 하나님이 그들의 마음에 당신의 뜻을 이루려는 마음을 주셨거든. 한마음이 되어 자기들의 왕국을 짐승에게 줄 거야. 하나님의 말씀이 이루어질 때까지 말이야. 네가 본 여자는 땅의 왕들을 다스리는 큰 도시야.”</w:t>
+              <w:t>천사가 나한테 말했어. “네가 본 물, 음녀가 앉은 곳은 백성과 무리와 민족과 언어야. 네가 본 열 뿔과 짐승이 음녀를 미워할 거야. 그 여자를 모욕하고, 벌거벗기고, 이빨로 찢어발기고, 불에 태울 거야. 하나님이 그들의 마음에 당신의 뜻을 이루려는 마음을 주셨거든. 한마음이 되어 자기들의 왕국을 짐승에게 줄 거야. 하나님의 말씀이 이루어질 때까지 말이야. 네가 본 여자는 땅의 왕들을 다스리는 큰 도시야.”</w:t>
             </w:r>
           </w:p>
         </w:tc>
@@ -13822,7 +13822,7 @@
               <w:rPr>
                 <w:sz w:val="18"/>
               </w:rPr>
-              <w:t>그 후에 내가 봤어. 다른 천사가 하늘에서 내려오는 걸. 큰 권세를 가지고 있었어. 땅이 그분의 영광으로 빛났어. 큰 목소리로 외쳤어. “무너졌다! 큰 바벨론이 무너졌다! 귀신들의 처소, 모든 더러운 영의 소굴, 모든 더럽고 미운 새의 소굴이 되었어! 모든 나라가 그 여자의 음행의 진노의 포도주를 마셨고, 땅의 왕들이 그 여자와 음행했고, 땅의 상인들이 그 여자의 사치의 권세로 부자가 되었거든.”</w:t>
+              <w:t>그 후에 내가 봤어. 다른 천사가 하늘에서 내려오는 걸. 큰 권세를 가지고 있었어. 땅이 그분의 영광으로 빛났어. 큰 목소리로 외쳤어. “망했다, 망했다, 큰 바벨론이 망했다! 귀신들의 유령 도시가 됐어! 모든 더러운 영의 주둔지, 모든 더럽고 미운 새들의 새장이 됐어! 모든 나라가 그 여자의 음행의 포도주를 마셨고, 땅의 왕들이 그 여자와 음행했고, 땅의 상인들이 그 여자의 사치의 권세로 부자가 되었거든.”</w:t>
             </w:r>
           </w:p>
         </w:tc>
@@ -13893,7 +13893,7 @@
               <w:rPr>
                 <w:sz w:val="18"/>
               </w:rPr>
-              <w:t>하늘에서 또 다른 목소리를 들었어. “내 백성아, 거기서 나와라! 그 여자의 죄에 참여하지 말고, 그 여자가 받을 재앙을 받지 않게 하라. 그 여자의 죄가 하늘에 닿았고, 하나님이 그 여자의 불의를 기억하셨거든. 그 여자가 너희에게 한 대로 갚아줘라! 그 행위의 두 배를 갚아줘라! 그 여자가 섞은 잔에 두 배를 섞어줘라! 그 여자가 영광과 사치를 누린 만큼, 괴로움과 슬픔을 줘라! 그 여자가 마음속으로 말했거든. ‘나는 여왕으로 앉아 있어. 과부가 아니야. 슬픔을 겪지 않을 거야.’ 그러니 하루에 그 여자의 재앙이 임할 거야. 죽음과 슬픔과 기근이야. 불에 태워질 거야. 그 여자를 심판하시는 주 하나님은 강하시거든.”</w:t>
+              <w:t>하늘에서 또 다른 목소리를 들었어. “내 백성아, 거기서 나와라! 그 여자의 죄에 참여하지 말고, 그 여자가 받을 재앙을 받지 않게 하라. 그 여자의 죄가 하늘에 닿았고, 하나님이 그 여자의 불의를 기억하셨거든. 그 여자가 너희에게 한 대로 갚아줘라! 그 행위의 두 배를 갚아줘라! 그 여자가 섞은 잔에 두 배를 섞어줘라! 그 여자가 영광과 사치를 누린 만큼, 괴로움과 슬픔을 줘라! 그 여자가 마음속으로 말했거든. ‘나는 여왕으로 앉아 있어. 과부가 아니야. 내 얼굴엔 눈물 한 방울 없을 거야.’ 그러니 하루에 그 여자의 재앙이 임할 거야. 죽음과 슬픔과 기근이야. 불에 태워질 거야. 그 여자를 심판하시는 주 하나님은 강하시거든.”</w:t>
             </w:r>
           </w:p>
         </w:tc>
@@ -13972,7 +13972,7 @@
               <w:rPr>
                 <w:sz w:val="18"/>
               </w:rPr>
-              <w:t>그 여자와 음행하고 사치하던 땅의 왕들이 그 여자를 위해 울고 가슴을 칠 거야. 그 여자가 타는 연기를 볼 때 말이야. 그 여자의 고통이 두려워서 멀리 서서 말할 거야.</w:t>
+              <w:t>밤마다 그 여자의 창관에 드나들던 땅의 왕들이 그 여자를 위해 울고 가슴을 칠 거야. 그 여자가 타는 연기를 볼 때 말이야. 그 여자의 고통이 두려워서 멀리 서서 말할 거야.</w:t>
             </w:r>
           </w:p>
         </w:tc>
@@ -14138,7 +14138,7 @@
               <w:rPr>
                 <w:sz w:val="18"/>
               </w:rPr>
-              <w:t>땅의 상인들이 그 여자를 위해 울고 슬퍼할 거야. 그들의 상품을 사는 사람이 아무도 없거든. 금, 은, 보석, 진주, 세마포, 자주색 천, 비단, 주홍색 천, 모든 향나무, 상아로 만든 온갖 물건, 값진 나무와 놋과 철과 대리석으로 만든 온갖 물건, 계피, 향료, 향, 몰약, 유향, 포도주, 기름, 고운 밀가루, 밀, 소, 양, 말, 수레, 종들, 사람들의 영혼까지.</w:t>
+              <w:t>땅의 상인들이 그 여자를 위해 울고 슬퍼할 거야. 그들의 상품을 사는 사람이 아무도 없거든. 금, 은, 보석, 진주, 세마포, 자주색 천, 비단, 주홍색 천, 모든 향나무, 상아로 만든 온갖 물건, 값진 나무와 놋과 철과 대리석으로 만든 온갖 물건, 계피, 향료, 향, 몰약, 유향, 포도주, 기름, 고운 밀가루, 밀, 소, 양, 말, 수레, 노예 노동 매매와 사람들의 목숨까지.</w:t>
             </w:r>
           </w:p>
         </w:tc>
@@ -14209,7 +14209,7 @@
               <w:rPr>
                 <w:sz w:val="18"/>
               </w:rPr>
-              <w:t>“네 영혼이 탐하던 열매가 너를 떠났고, 모든 맛있고 화려한 것들이 너를 떠났어. 사람들이 다시는 그것들을 찾지 못할 거야.”</w:t>
+              <w:t>“네가 죽도록 원하던 모든 게 사라졌어. 네 화려한 사치품들도 다 사라졌어. 사람들은 그걸 다시는 절대 못 볼 거야.”</w:t>
             </w:r>
           </w:p>
         </w:tc>
@@ -14430,7 +14430,7 @@
               <w:rPr>
                 <w:sz w:val="18"/>
               </w:rPr>
-              <w:t>모든 선장과 항해자와 선원들과 바다에서 일하는 사람들이 멀리 서서, 그 여자가 타는 연기를 보고 외쳤어. “어떤 도시가 이 큰 도시와 같았느냐?” 그들이 머리에 먼지를 뿌리고 울고 슬퍼하며 외쳤어.</w:t>
+              <w:t>모든 선장과 항해자와 선원들과 바다에서 일하는 사람들이 멀리 서서, 그 여자가 타는 연기를 보고 외쳤어. “어떤 도시가 이 큰 도시와 같았느냐?” 그들이 머리에 먼지를 뿌리고 세상이 끝난 것처럼 울며 외쳤어.</w:t>
             </w:r>
           </w:p>
         </w:tc>
@@ -14572,7 +14572,7 @@
               <w:rPr>
                 <w:sz w:val="18"/>
               </w:rPr>
-              <w:t>하늘아, 그 여자를 두고 기뻐하라! 성도들과 사도들과 예언자들아, 기뻐하라! 하나님이 너희를 위해 그 여자를 심판하셨거든!</w:t>
+              <w:t>하늘아, 그 여자를 두고 기뻐하라! 성도들과 사도들과 예언자들아, 기뻐하라! 하나님이 너희를 위해 그 여자를 심판하셨거든! 그 여자가 너희한테 저지른 모든 잘못을 심판하셨거든!</w:t>
             </w:r>
           </w:p>
         </w:tc>
@@ -14722,7 +14722,7 @@
               <w:rPr>
                 <w:sz w:val="18"/>
               </w:rPr>
-              <w:t>“큰 도시 바벨론이 이렇게 세차게 던져질 거야. 다시는 찾을 수 없을 거야. 거문고 타는 사람들과 노래하는 사람들과 피리 부는 사람들과 나팔 부는 사람들의 소리가 다시는 네 안에서 들리지 않을 거야. 어떤 기술자도 다시는 네 안에서 찾지 못할 거야. 맷돌 소리가 다시는 네 안에서 들리지 않을 거야. 등불 빛이 다시는 네 안에서 비치지 않을 거야. 신랑과 신부의 목소리가 다시는 네 안에서 들리지 않을 거야. 네 상인들이 땅의 큰 자들이었고, 네 마술로 모든 나라가 속았거든. 예언자들과 성도들과 땅에서 죽임당한 모든 사람들의 피가 그 여자 안에서 발견되었어.”</w:t>
+              <w:t>“큰 도시 바벨론이 이렇게 세차게 던져질 거야. 다시는 찾을 수 없을 거야. 기타 치는 사람들과 노래하는 사람들, 피리 부는 사람들과 트럼펫 부는 사람들의 음악이 다시는 네 안에서 들리지 않을 거야. 어떤 기술자도 다시는 네 안에서 찾지 못할 거야. 맷돌 소리가 다시는 네 안에서 들리지 않을 거야. 등불 빛이 다시는 네 안에서 비치지 않을 거야. 신랑과 신부의 목소리가 다시는 네 안에서 들리지 않을 거야. 네 상인들이 땅의 큰 자들이었고, 네 마술로 모든 나라가 속았거든. 그 도시는 예언자들과 하나님의 거룩한 백성을 죽였고, 온 땅에서 죽임당한 사람들의 피가 그 여자 안에서 발견되었어.”</w:t>
             </w:r>
           </w:p>
         </w:tc>
@@ -14947,7 +14947,7 @@
               <w:rPr>
                 <w:sz w:val="18"/>
               </w:rPr>
-              <w:t>그 후에 내가 들었어. 하늘에서 큰 무리의 우렁찬 목소리가 있었어. “할렐루야! 구원과 영광과 권세가 우리 하나님께 있다! 그분의 심판은 참되고 의롭다! 음행으로 땅을 망하게 한 큰 음녀를 심판하셨고, 그 여자의 손에 있는 자기 종들의 피를 갚아주셨거든.”</w:t>
+              <w:t>그 후에 내가 들었어. 하늘에서 대규모 합창단 같은 우렁찬 목소리가 있었어. “할렐루야! 구원과 영광과 권세가 하나님께 있어! 그분의 심판은 참되고 의롭다! 음행으로 땅을 망하게 한 큰 음녀를 심판하셨고, 자기 종들의 피를 갚아주셨거든.”</w:t>
             </w:r>
           </w:p>
         </w:tc>
@@ -15168,7 +15168,7 @@
               <w:rPr>
                 <w:sz w:val="18"/>
               </w:rPr>
-              <w:t>“아멘! 할렐루야!”</w:t>
+              <w:t>“아멘! 그래! 할렐루야!”</w:t>
             </w:r>
           </w:p>
         </w:tc>
@@ -15744,7 +15744,7 @@
               <w:rPr>
                 <w:sz w:val="18"/>
               </w:rPr>
-              <w:t>하늘이 열린 걸 봤어. 흰 말이 있었어! 그 말을 타신 분은 신실하고 참되시다고 불리셔. 의로 심판하고 싸우셔. 그분의 눈은 불꽃 같고, 머리에는 많은 면류관이 있으셔. 그분만이 아시는 이름이 새겨져 있으셔. 피에 적신 옷을 입으셨어. 그분의 이름은 하나님의 말씀이라고 불리셔. 하늘의 군대들이 흰 말을 타고, 깨끗하고 흰 세마포를 입고 그분을 따랐어. 그분의 입에서는 날카로운 검이 나와. 그걸로 민족들을 치고, 쇠지팡이로 다스리실 거야. 전능하신 하나님의 맹렬한 진노의 포도주 틀을 밟으셔. 그분의 옷과 넓적다리에는 이름이 쓰여 있어. “만왕의 왕, 만주의 주.”</w:t>
+              <w:t>하늘이 열린 걸 봤어. 흰 말이 있었어! 그 말을 타신 분은 신실하고 참되시다고 불리셔. 의로 심판하고 싸우셔. 그분의 눈은 불꽃 같고, 머리에는 많은 면류관이 있으셔. 그분만이 아시는 이름이 새겨져 있으셔. 피에 적신 옷을 입으셨어. 그분의 이름은 하나님의 말씀이라고 불리셔. 하늘의 군대들이 흰 말을 타고, 깨끗하고 흰 세마포를 입고 그분을 따랐어. 그분의 입에서는 날카로운 검이 나와. 그걸로 민족들을 제압하고, 쇠지팡이로 다스리실 거야. 전능하신 하나님의 맹렬한 진노의 포도주 틀을 밟으셔. 그분의 옷과 넓적다리에는 이름이 쓰여 있어. “만왕의 왕, 만주의 주.”</w:t>
             </w:r>
           </w:p>
         </w:tc>
@@ -15886,7 +15886,7 @@
               <w:rPr>
                 <w:sz w:val="18"/>
               </w:rPr>
-              <w:t>짐승과 땅의 왕들과 그들의 군대들이 모여서 말 타신 분과 그분의 군대와 싸우려는 걸 봤어. 짐승이 잡혔어. 그 앞에서 표적을 행하던 거짓 예언자도 함께 잡혔어. 그 표적들로 짐승의 표를 받은 사람들과 그 우상에게 경배하는 사람들을 속였거든. 이 둘이 산 채로 불과 유황으로 타는 못에 던져졌어. 나머지는 말 타신 분의 입에서 나오는 검으로 죽임을 당했어. 모든 새가 그들의 살로 배불리 먹었어.</w:t>
+              <w:t>짐승과 땅의 왕들과 그들의 군대들이 모여서 말 타신 분과 그분의 군대와 싸우려는 걸 봤어. 짐승이 잡혔어. 그분의 꼭두각시, 그 앞에서 표적을 행하던 거짓 예언자도 함께 잡혔어. 그 표적들로 짐승의 표를 받은 사람들과 그 우상에게 경배하는 사람들을 현혹시켰거든. 이 둘이 산 채로 불과 유황으로 타는 못에 던져졌어. 나머지는 말 타신 분의 입에서 나오는 검으로 죽임을 당했어. 모든 새가 그들의 살로 배불리 먹었어.</w:t>
             </w:r>
           </w:p>
         </w:tc>
@@ -16158,7 +16158,7 @@
               <w:rPr>
                 <w:sz w:val="18"/>
               </w:rPr>
-              <w:t>보좌들을 봤어. 심판할 권세를 받은 사람들이 그 보좌에 앉았어. 예수의 증언과 하나님의 말씀 때문에 목 베임을 당한 사람들의 영혼도 봤어. 짐승이나 그 우상에게 경배하지 않고, 이마나 손에 표를 받지 않은 사람들이야. 그들이 살아서 그리스도와 함께 천 년 동안 왕 노릇 했어. 나머지 죽은 사람들은 천 년이 끝날 때까지 살지 못했어. 이것이 첫째 부활이야. 첫째 부활에 참여하는 사람은 복이 있고 거룩해. 둘째 사망이 그들을 다스릴 권세가 없어! 그들은 하나님과 그리스도의 제사장이 되어 천 년 동안 그분과 함께 왕 노릇 할 거야.</w:t>
+              <w:t>보좌들을 봤어. 심판할 권세를 받은 사람들이 그 보좌에 앉았어. 예수의 증언과 하나님의 말씀 때문에 목 베임을 당한 사람들의 영혼도 봤어. 짐승이나 그 우상에게 경배하지 않고, 이마나 손에 표를 받지 않은 사람들이야. 그들이 살아서 그리스도와 함께 천 년 동안 왕 노릇 했어. 나머지 죽은 사람들은 천 년이 끝날 때까지 살지 못했어. 이것이 첫째 부활이야. 첫째 부활에 참여하는 사람은 가장 복 받고, 가장 거룩해. 둘째 사망은 그들을 건드릴 수 없어! 그들은 하나님과 그리스도의 제사장이 되어 천 년 동안 그분과 함께 왕 노릇 할 거야.</w:t>
             </w:r>
           </w:p>
         </w:tc>
@@ -16229,7 +16229,7 @@
               <w:rPr>
                 <w:sz w:val="18"/>
               </w:rPr>
-              <w:t>천 년이 끝나면 사탄이 감옥에서 풀려날 거야. 민족들을 속이려고 나갈 거야. 땅의 네 모퉁이에 있는 곡과 마곡을 속여서 전쟁을 위해 모으려고. 어마어마한 군대야, 수백만 명이 모였어. 그들이 땅의 넓은 곳으로 올라와서 성도들의 진과 사랑받는 도시를 에워쌌어. 그런데 하늘에서 불이 내려와서 그들을 삼켰어. 그들을 속이던 마귀가 불과 유황 못에 던져졌어. 짐승과 거짓 예언자도 있는 곳이야. 거기서 밤낮 영원히 괴로움을 받을 거야.</w:t>
+              <w:t>천 년이 끝나면 사탄이 감옥에서 풀려날 거야. 민족들을 속이려고 나갈 거야. 땅의 구석구석에 있는 곡과 마곡을 속여서 전쟁을 위해 모으려고. 어마어마한 군대야, 수백만 명이 모였어. 그들이 땅의 넓은 곳으로 올라와서 성도들의 진과 사랑받는 도시를 에워쌌어. 그런데 하늘에서 불이 내려와서 그들을 태워버렸어. 그들을 속이던 마귀가 불과 유황 못에 던져졌어. 짐승과 거짓 예언자도 있는 곳이야. 거기서 밤낮 영원히 괴로움을 받을 거야.</w:t>
             </w:r>
           </w:p>
         </w:tc>
@@ -16363,7 +16363,7 @@
               <w:rPr>
                 <w:sz w:val="18"/>
               </w:rPr>
-              <w:t>큰 흰 보좌와 그 위에 앉으신 분을 봤어. 그분의 낯을 피해서 하늘과 땅이 사라졌어. 그들을 둘 곳이 없었어. 죽은 사람들, 큰 자와 작은 자가 보좌 앞에 서 있는 걸 봤어. 책들이 펴졌어. 또 다른 책이 펴졌어. 생명책이야. 죽은 사람들이 책에 기록된 대로, 자기들의 행위대로 심판을 받았어. 바다가 그 안에 있는 죽은 사람들을 내주었고, 사망과 지옥도 그 안에 있는 죽은 사람들을 내주었어. 각 사람이 자기들의 행위대로 심판을 받았어. 사망과 지옥이 불못에 던져졌어. 이것이 둘째 사망이야—불못 말이야. 생명책에 이름이 기록되지 않은 사람은 불못에 던져졌어.</w:t>
+              <w:t>큰 흰 보좌와 그 위에 앉으신 분을 봤어. 그분 앞에서는 아무것도 설 수 없었어. 하늘이 사라지고, 땅이 사라지고, 둘 곳이 없었어. 죽은 사람들, 큰 자와 작은 자가 보좌 앞에 서 있는 걸 봤어. 책들이 펴졌어. 또 다른 책이 펴졌어. 생명책이야. 죽은 사람들이 책에 기록된 대로, 자기들의 행위대로 심판을 받았어. 바다가 그 안에 있는 죽은 사람들을 내주었고, 사망과 지옥도 그 안에 있는 죽은 사람들을 내주었어. 각 사람이 자기들의 행위대로 심판을 받았어. 사망과 지옥이 불못에 던져졌어. 이것이 둘째 사망이야—불못 말이야. 생명책에 이름이 기록되지 않은 사람은 불못에 던져졌어.</w:t>
             </w:r>
           </w:p>
         </w:tc>
@@ -16374,7 +16374,7 @@
         <w:pStyle w:val="Heading1"/>
       </w:pPr>
       <w:r>
-        <w:t>Chapter 21 — The Ultimate Transformation</w:t>
+        <w:t>Chapter 21 — The Ultimate New Beginning</w:t>
       </w:r>
     </w:p>
     <w:tbl>
@@ -16777,7 +16777,7 @@
               <w:rPr>
                 <w:sz w:val="18"/>
               </w:rPr>
-              <w:t>그분이 말씀하셨어. “다 이루었다. 나는 A부터 Z까지야. 나는 시작이고, 나는 끝이야. 목마른 사람에게 생명수 샘에서 공짜로 줄 거야. 이기는 사람은 이 모든 것을 상속받을 거야. 내가 그들에게 하나님이 되고, 그들은 내 아들과 딸이 될 거야. 하지만 나머지—비겁하고 믿음 없는 자, 타락한 자와 살인자, 음행하는 자와 마술하는 자, 우상 숭배자와 모든 거짓말쟁이—그들에게는 불과 유황 못이야. 둘째 사망!”</w:t>
+              <w:t>그분이 말씀하셨어. “다 됐어. 나는 A부터 Z까지야. 나는 시작이고, 나는 끝이야. 목마른 사람에게 생명수 샘에서 공짜로 줄 거야. 이기는 사람은 이 모든 것을 상속받을 거야. 내가 그들에게 하나님이 되고, 그들은 내 아들과 딸이 될 거야. 하지만 나머지—무책임하고 믿음 없는 자, 타락한 자와 살인자, 음행하는 자와 마술하는 자, 우상 숭배자와 모든 거짓말쟁이—그들에게는 불과 유황 못이야. 둘째 사망!”</w:t>
             </w:r>
           </w:p>
         </w:tc>

</xml_diff>